<commit_message>
Build first per-UI mockups: Home + Configurator (Warm Workshop, #2)
- mockups/home.html: full Warm Workshop home (hero, trust strip, featured styles,
  how-custom-works, shop-by-room, reviews, made-to-order/no-returns note, newsletter,
  footer, mobile preview). Tokens alias the CRM --mj-* set (D12).
- mockups/configurator.html: interactive flagship configurator — style (Tile/Art Back/
  Floating), length, wood swatches, finish, tile pattern/color, back-art picker, hooks,
  locked/hybrid engraving; embedded-engine viewer with HUD + 4K render state; live price
  + breakdown via CRM-engine logic; made-to-order microcopy; mobile sticky CTA.
- tools/render_mockups.mjs: render ALL mockups/*.html → assets/ PDFs + PNGs.
- UI Standard register: Home + Configurator marked 'in review'.
- Regenerate Word docs.

https://claude.ai/code/session_01PjUHwFTYmLhh9nLNKk68Yq
</commit_message>
<xml_diff>
--- a/word/02-UI-Design-Standard.docx
+++ b/word/02-UI-Design-Standard.docx
@@ -4977,7 +4977,7 @@
           </w:tcPr>
           <w:p>
             <w:r>
-              <w:t>☐</w:t>
+              <w:t>◐ in review</w:t>
             </w:r>
           </w:p>
         </w:tc>
@@ -5085,7 +5085,7 @@
           </w:tcPr>
           <w:p>
             <w:r>
-              <w:t>☐</w:t>
+              <w:t>◐ in review</w:t>
             </w:r>
           </w:p>
         </w:tc>

</xml_diff>

<commit_message>
Build Collection, Product PDP, Private/Hybrid listing, and Cart (Scandi Light)
- mockups/scandi.css: shared Scandi Light design system (tokens, header/footer, product
  card, reviews block, price card, made-to-order) for the per-UI mockups.
- collection.html: Drawer Boxes collection — filter rail (type/joinery/wood/width/price) +
  sortable product grid with star badges.
- product.html: ready-made PDP — gallery + variant chips + made-to-size note + specs +
  full customer reviews (no histogram) + related products.
- private-listing.html: quote-backed Private/Hybrid PDP — 'Prepared for {name}' banner +
  expiry, locked options (read-only chips) + editable 'you can change' options, CRM price.
- cart.html: config snapshot + 4K render thumbnail per line, order summary, no-returns,
  Shopify-native checkout.
- Register: Home + Configurator ✓ approved; the four new pages in review. Regenerate docx.

https://claude.ai/code/session_01PjUHwFTYmLhh9nLNKk68Yq
</commit_message>
<xml_diff>
--- a/word/02-UI-Design-Standard.docx
+++ b/word/02-UI-Design-Standard.docx
@@ -5140,7 +5140,7 @@
           </w:tcPr>
           <w:p>
             <w:r>
-              <w:t>◐ in review</w:t>
+              <w:t>✓ approved</w:t>
             </w:r>
           </w:p>
         </w:tc>
@@ -5176,7 +5176,7 @@
           </w:tcPr>
           <w:p>
             <w:r>
-              <w:t>☐</w:t>
+              <w:t>◐ in review</w:t>
             </w:r>
           </w:p>
         </w:tc>
@@ -5212,7 +5212,7 @@
           </w:tcPr>
           <w:p>
             <w:r>
-              <w:t>☐</w:t>
+              <w:t>◐ in review</w:t>
             </w:r>
           </w:p>
         </w:tc>
@@ -5224,7 +5224,7 @@
           </w:tcPr>
           <w:p>
             <w:r>
-              <w:t>Configurator (Tile / Art Back) + 4K viewer</w:t>
+              <w:t>Configurator (product-type tabs) + 4K viewer</w:t>
             </w:r>
           </w:p>
         </w:tc>
@@ -5248,7 +5248,7 @@
           </w:tcPr>
           <w:p>
             <w:r>
-              <w:t>◐ in review</w:t>
+              <w:t>✓ approved</w:t>
             </w:r>
           </w:p>
         </w:tc>
@@ -5284,7 +5284,7 @@
           </w:tcPr>
           <w:p>
             <w:r>
-              <w:t>☐</w:t>
+              <w:t>◐ in review</w:t>
             </w:r>
           </w:p>
         </w:tc>
@@ -5320,7 +5320,7 @@
           </w:tcPr>
           <w:p>
             <w:r>
-              <w:t>☐</w:t>
+              <w:t>◐ in review</w:t>
             </w:r>
           </w:p>
         </w:tc>

</xml_diff>

<commit_message>
Build Account, My Quotes, Content/Policy + Components sheet (Scandi Light)
- account.html: account dashboard — nav, recent orders (status badges), saved designs.
- account-quotes.html: My quotes — CRM-pushed private/hybrid listings with status/expiry.
- content.html: made-to-order/no-returns policy + FAQ accordion.
- components.html: consolidated style-guide — tokens, buttons, forms (+error), mega-menu,
  product card, price block, quote banner, cart line, reviews + write-a-review modal,
  empty/loading/error states, toasts, dialog.
- Register: Collection/Product/Private/Cart ✓ approved; Account/Quotes/Content ◐; component
  rows consolidated into components.html. Regenerate docx.

https://claude.ai/code/session_01PjUHwFTYmLhh9nLNKk68Yq
</commit_message>
<xml_diff>
--- a/word/02-UI-Design-Standard.docx
+++ b/word/02-UI-Design-Standard.docx
@@ -5176,7 +5176,7 @@
           </w:tcPr>
           <w:p>
             <w:r>
-              <w:t>◐ in review</w:t>
+              <w:t>✓ approved</w:t>
             </w:r>
           </w:p>
         </w:tc>
@@ -5212,7 +5212,7 @@
           </w:tcPr>
           <w:p>
             <w:r>
-              <w:t>◐ in review</w:t>
+              <w:t>✓ approved</w:t>
             </w:r>
           </w:p>
         </w:tc>
@@ -5284,7 +5284,7 @@
           </w:tcPr>
           <w:p>
             <w:r>
-              <w:t>◐ in review</w:t>
+              <w:t>✓ approved</w:t>
             </w:r>
           </w:p>
         </w:tc>
@@ -5320,7 +5320,7 @@
           </w:tcPr>
           <w:p>
             <w:r>
-              <w:t>◐ in review</w:t>
+              <w:t>✓ approved</w:t>
             </w:r>
           </w:p>
         </w:tc>
@@ -5356,7 +5356,7 @@
           </w:tcPr>
           <w:p>
             <w:r>
-              <w:t>☐</w:t>
+              <w:t>◐ in review</w:t>
             </w:r>
           </w:p>
         </w:tc>
@@ -5392,7 +5392,7 @@
           </w:tcPr>
           <w:p>
             <w:r>
-              <w:t>☐</w:t>
+              <w:t>◐ in review</w:t>
             </w:r>
           </w:p>
         </w:tc>
@@ -5428,7 +5428,7 @@
           </w:tcPr>
           <w:p>
             <w:r>
-              <w:t>☐</w:t>
+              <w:t>◐ in review</w:t>
             </w:r>
           </w:p>
         </w:tc>
@@ -5517,7 +5517,7 @@
                 <w:rFonts w:ascii="Consolas" w:hAnsi="Consolas"/>
                 <w:sz w:val="19"/>
               </w:rPr>
-              <w:t>mockups/components/header.html</w:t>
+              <w:t>mockups/components.html</w:t>
             </w:r>
           </w:p>
         </w:tc>
@@ -5527,7 +5527,7 @@
           </w:tcPr>
           <w:p>
             <w:r>
-              <w:t>☐</w:t>
+              <w:t>◐ in review</w:t>
             </w:r>
           </w:p>
         </w:tc>
@@ -5553,7 +5553,7 @@
                 <w:rFonts w:ascii="Consolas" w:hAnsi="Consolas"/>
                 <w:sz w:val="19"/>
               </w:rPr>
-              <w:t>mockups/components/product-card.html</w:t>
+              <w:t>mockups/components.html</w:t>
             </w:r>
           </w:p>
         </w:tc>
@@ -5563,7 +5563,7 @@
           </w:tcPr>
           <w:p>
             <w:r>
-              <w:t>☐</w:t>
+              <w:t>◐ in review</w:t>
             </w:r>
           </w:p>
         </w:tc>
@@ -5589,7 +5589,7 @@
                 <w:rFonts w:ascii="Consolas" w:hAnsi="Consolas"/>
                 <w:sz w:val="19"/>
               </w:rPr>
-              <w:t>mockups/components/configurator-panel.html</w:t>
+              <w:t>mockups/components.html</w:t>
             </w:r>
           </w:p>
         </w:tc>
@@ -5599,7 +5599,7 @@
           </w:tcPr>
           <w:p>
             <w:r>
-              <w:t>☐</w:t>
+              <w:t>◐ in review</w:t>
             </w:r>
           </w:p>
         </w:tc>
@@ -5625,7 +5625,7 @@
                 <w:rFonts w:ascii="Consolas" w:hAnsi="Consolas"/>
                 <w:sz w:val="19"/>
               </w:rPr>
-              <w:t>mockups/components/render-viewer.html</w:t>
+              <w:t>mockups/components.html</w:t>
             </w:r>
           </w:p>
         </w:tc>
@@ -5635,7 +5635,7 @@
           </w:tcPr>
           <w:p>
             <w:r>
-              <w:t>☐</w:t>
+              <w:t>◐ in review</w:t>
             </w:r>
           </w:p>
         </w:tc>
@@ -5661,7 +5661,7 @@
                 <w:rFonts w:ascii="Consolas" w:hAnsi="Consolas"/>
                 <w:sz w:val="19"/>
               </w:rPr>
-              <w:t>mockups/components/price-block.html</w:t>
+              <w:t>mockups/components.html</w:t>
             </w:r>
           </w:p>
         </w:tc>
@@ -5671,7 +5671,7 @@
           </w:tcPr>
           <w:p>
             <w:r>
-              <w:t>☐</w:t>
+              <w:t>◐ in review</w:t>
             </w:r>
           </w:p>
         </w:tc>
@@ -5697,7 +5697,7 @@
                 <w:rFonts w:ascii="Consolas" w:hAnsi="Consolas"/>
                 <w:sz w:val="19"/>
               </w:rPr>
-              <w:t>mockups/components/quote-banner.html</w:t>
+              <w:t>mockups/components.html</w:t>
             </w:r>
           </w:p>
         </w:tc>
@@ -5707,7 +5707,7 @@
           </w:tcPr>
           <w:p>
             <w:r>
-              <w:t>☐</w:t>
+              <w:t>◐ in review</w:t>
             </w:r>
           </w:p>
         </w:tc>
@@ -5733,7 +5733,7 @@
                 <w:rFonts w:ascii="Consolas" w:hAnsi="Consolas"/>
                 <w:sz w:val="19"/>
               </w:rPr>
-              <w:t>mockups/components/cart-line.html</w:t>
+              <w:t>mockups/components.html</w:t>
             </w:r>
           </w:p>
         </w:tc>
@@ -5743,7 +5743,7 @@
           </w:tcPr>
           <w:p>
             <w:r>
-              <w:t>☐</w:t>
+              <w:t>◐ in review</w:t>
             </w:r>
           </w:p>
         </w:tc>
@@ -5769,7 +5769,7 @@
                 <w:rFonts w:ascii="Consolas" w:hAnsi="Consolas"/>
                 <w:sz w:val="19"/>
               </w:rPr>
-              <w:t>mockups/components/forms.html</w:t>
+              <w:t>mockups/components.html</w:t>
             </w:r>
           </w:p>
         </w:tc>
@@ -5779,7 +5779,7 @@
           </w:tcPr>
           <w:p>
             <w:r>
-              <w:t>☐</w:t>
+              <w:t>◐ in review</w:t>
             </w:r>
           </w:p>
         </w:tc>
@@ -5805,7 +5805,7 @@
                 <w:rFonts w:ascii="Consolas" w:hAnsi="Consolas"/>
                 <w:sz w:val="19"/>
               </w:rPr>
-              <w:t>mockups/components/states.html</w:t>
+              <w:t>mockups/components.html</w:t>
             </w:r>
           </w:p>
         </w:tc>
@@ -5815,7 +5815,7 @@
           </w:tcPr>
           <w:p>
             <w:r>
-              <w:t>☐</w:t>
+              <w:t>◐ in review</w:t>
             </w:r>
           </w:p>
         </w:tc>
@@ -5841,7 +5841,7 @@
                 <w:rFonts w:ascii="Consolas" w:hAnsi="Consolas"/>
                 <w:sz w:val="19"/>
               </w:rPr>
-              <w:t>mockups/components/overlays.html</w:t>
+              <w:t>mockups/components.html</w:t>
             </w:r>
           </w:p>
         </w:tc>
@@ -5851,7 +5851,7 @@
           </w:tcPr>
           <w:p>
             <w:r>
-              <w:t>☐</w:t>
+              <w:t>◐ in review</w:t>
             </w:r>
           </w:p>
         </w:tc>
@@ -5877,7 +5877,7 @@
                 <w:rFonts w:ascii="Consolas" w:hAnsi="Consolas"/>
                 <w:sz w:val="19"/>
               </w:rPr>
-              <w:t>mockups/components/reviews.html</w:t>
+              <w:t>mockups/components.html</w:t>
             </w:r>
           </w:p>
         </w:tc>
@@ -5887,7 +5887,7 @@
           </w:tcPr>
           <w:p>
             <w:r>
-              <w:t>☐</w:t>
+              <w:t>◐ in review</w:t>
             </w:r>
           </w:p>
         </w:tc>
@@ -5913,7 +5913,7 @@
                 <w:rFonts w:ascii="Consolas" w:hAnsi="Consolas"/>
                 <w:sz w:val="19"/>
               </w:rPr>
-              <w:t>mockups/components/write-review.html</w:t>
+              <w:t>mockups/components.html</w:t>
             </w:r>
           </w:p>
         </w:tc>
@@ -5923,7 +5923,7 @@
           </w:tcPr>
           <w:p>
             <w:r>
-              <w:t>☐</w:t>
+              <w:t>◐ in review</w:t>
             </w:r>
           </w:p>
         </w:tc>

</xml_diff>

<commit_message>
Add API/job-queue contracts (OpenAPI) and scaffold Shopify OS 2.0 theme
- api/openapi.yaml + docs/06-API-Contracts.md: the four integration contracts — CRM job
  queue (claim/complete, render_4k/atelier_import/shopify_push), Shopify order webhook →
  store_orders, and the 4kGraphics render service (/v1/render, /v1/buildplan). Auth,
  idempotency, versioning, pricing-authority rules.
- theme/: Shopify Online Store 2.0 theme scaffold from the approved Scandi Light mockups —
  layout, sections (header/footer/hero/product-categories/reviews/configurator/main-*),
  snippets (product-card/price-block/made-to-order), templates (index/product/collection/
  cart/page.configurator), assets (scandi.css, theme.css, configurator.js), config + locales.
  Configurator template embeds the 4kGraphics engine; price via CRM engine.
- Register: Account/Quotes/Content/Components ✓ approved. README + docx updated.

https://claude.ai/code/session_01PjUHwFTYmLhh9nLNKk68Yq
</commit_message>
<xml_diff>
--- a/word/02-UI-Design-Standard.docx
+++ b/word/02-UI-Design-Standard.docx
@@ -5356,7 +5356,7 @@
           </w:tcPr>
           <w:p>
             <w:r>
-              <w:t>◐ in review</w:t>
+              <w:t>✓ approved</w:t>
             </w:r>
           </w:p>
         </w:tc>
@@ -5392,7 +5392,7 @@
           </w:tcPr>
           <w:p>
             <w:r>
-              <w:t>◐ in review</w:t>
+              <w:t>✓ approved</w:t>
             </w:r>
           </w:p>
         </w:tc>
@@ -5428,7 +5428,7 @@
           </w:tcPr>
           <w:p>
             <w:r>
-              <w:t>◐ in review</w:t>
+              <w:t>✓ approved</w:t>
             </w:r>
           </w:p>
         </w:tc>
@@ -5527,7 +5527,7 @@
           </w:tcPr>
           <w:p>
             <w:r>
-              <w:t>◐ in review</w:t>
+              <w:t>✓ approved</w:t>
             </w:r>
           </w:p>
         </w:tc>
@@ -5563,7 +5563,7 @@
           </w:tcPr>
           <w:p>
             <w:r>
-              <w:t>◐ in review</w:t>
+              <w:t>✓ approved</w:t>
             </w:r>
           </w:p>
         </w:tc>
@@ -5599,7 +5599,7 @@
           </w:tcPr>
           <w:p>
             <w:r>
-              <w:t>◐ in review</w:t>
+              <w:t>✓ approved</w:t>
             </w:r>
           </w:p>
         </w:tc>
@@ -5635,7 +5635,7 @@
           </w:tcPr>
           <w:p>
             <w:r>
-              <w:t>◐ in review</w:t>
+              <w:t>✓ approved</w:t>
             </w:r>
           </w:p>
         </w:tc>
@@ -5671,7 +5671,7 @@
           </w:tcPr>
           <w:p>
             <w:r>
-              <w:t>◐ in review</w:t>
+              <w:t>✓ approved</w:t>
             </w:r>
           </w:p>
         </w:tc>
@@ -5707,7 +5707,7 @@
           </w:tcPr>
           <w:p>
             <w:r>
-              <w:t>◐ in review</w:t>
+              <w:t>✓ approved</w:t>
             </w:r>
           </w:p>
         </w:tc>
@@ -5743,7 +5743,7 @@
           </w:tcPr>
           <w:p>
             <w:r>
-              <w:t>◐ in review</w:t>
+              <w:t>✓ approved</w:t>
             </w:r>
           </w:p>
         </w:tc>
@@ -5779,7 +5779,7 @@
           </w:tcPr>
           <w:p>
             <w:r>
-              <w:t>◐ in review</w:t>
+              <w:t>✓ approved</w:t>
             </w:r>
           </w:p>
         </w:tc>
@@ -5815,7 +5815,7 @@
           </w:tcPr>
           <w:p>
             <w:r>
-              <w:t>◐ in review</w:t>
+              <w:t>✓ approved</w:t>
             </w:r>
           </w:p>
         </w:tc>
@@ -5851,7 +5851,7 @@
           </w:tcPr>
           <w:p>
             <w:r>
-              <w:t>◐ in review</w:t>
+              <w:t>✓ approved</w:t>
             </w:r>
           </w:p>
         </w:tc>
@@ -5887,7 +5887,7 @@
           </w:tcPr>
           <w:p>
             <w:r>
-              <w:t>◐ in review</w:t>
+              <w:t>✓ approved</w:t>
             </w:r>
           </w:p>
         </w:tc>
@@ -5923,7 +5923,7 @@
           </w:tcPr>
           <w:p>
             <w:r>
-              <w:t>◐ in review</w:t>
+              <w:t>✓ approved</w:t>
             </w:r>
           </w:p>
         </w:tc>

</xml_diff>